<commit_message>
ERP instead of ARP
</commit_message>
<xml_diff>
--- a/public/assets/files/Jad_Imad_Mosleh_CV.docx
+++ b/public/assets/files/Jad_Imad_Mosleh_CV.docx
@@ -56,33 +56,23 @@
     </w:p>
     <w:p>
       <w:r>
-        <w:t xml:space="preserve">Abela </w:t>
-      </w:r>
-      <w:proofErr w:type="gramStart"/>
-      <w:r>
-        <w:t>Delice  March</w:t>
-      </w:r>
-      <w:proofErr w:type="gramEnd"/>
-      <w:r>
-        <w:t xml:space="preserve"> 2026 – present </w:t>
-      </w:r>
-    </w:p>
-    <w:p>
-      <w:r>
-        <w:t xml:space="preserve"> Using Odoo an ARP system to help in IT activities such as accounting and reports</w:t>
-      </w:r>
-    </w:p>
-    <w:p>
-      <w:r>
-        <w:t xml:space="preserve">Building apps and websites such as company employee and document management systems, Food tracking app for secondary company </w:t>
-      </w:r>
-      <w:proofErr w:type="spellStart"/>
-      <w:r>
-        <w:t>BerryLite</w:t>
-      </w:r>
-      <w:proofErr w:type="spellEnd"/>
-      <w:r>
-        <w:t>, and salary calculator for employees</w:t>
+        <w:t xml:space="preserve">Abela Delice  March 2026 – present </w:t>
+      </w:r>
+    </w:p>
+    <w:p>
+      <w:r>
+        <w:t xml:space="preserve"> Using Odoo an </w:t>
+      </w:r>
+      <w:r>
+        <w:t>E</w:t>
+      </w:r>
+      <w:r>
+        <w:t>RP system to help in IT activities such as accounting and reports</w:t>
+      </w:r>
+    </w:p>
+    <w:p>
+      <w:r>
+        <w:t>Building apps and websites such as company employee and document management systems, Food tracking app for secondary company BerryLite, and salary calculator for employees</w:t>
       </w:r>
     </w:p>
     <w:p>
@@ -127,7 +117,7 @@
           <w:ilvl w:val="0"/>
           <w:numId w:val="1"/>
         </w:numPr>
-        <w:spacing w:after="0" w:line="240" w:lineRule="auto"/>
+        <w:spacing w:after="0"/>
         <w:contextualSpacing w:val="0"/>
       </w:pPr>
       <w:r>
@@ -141,7 +131,7 @@
           <w:ilvl w:val="0"/>
           <w:numId w:val="1"/>
         </w:numPr>
-        <w:spacing w:after="32" w:line="240" w:lineRule="auto"/>
+        <w:spacing w:after="32"/>
         <w:contextualSpacing w:val="0"/>
       </w:pPr>
       <w:r>
@@ -183,7 +173,6 @@
         <w:pStyle w:val="Heading1"/>
       </w:pPr>
       <w:r>
-        <w:lastRenderedPageBreak/>
         <w:t>EDUCATION</w:t>
       </w:r>
     </w:p>
@@ -207,32 +196,15 @@
       <w:pPr>
         <w:spacing w:after="48"/>
       </w:pPr>
-      <w:proofErr w:type="spellStart"/>
       <w:r>
         <w:rPr>
           <w:b/>
           <w:bCs/>
         </w:rPr>
-        <w:t>Tryhackme</w:t>
-      </w:r>
-      <w:proofErr w:type="spellEnd"/>
-      <w:r>
-        <w:rPr>
-          <w:b/>
-          <w:bCs/>
-        </w:rPr>
-        <w:t xml:space="preserve"> </w:t>
-      </w:r>
-      <w:r>
-        <w:t xml:space="preserve">(Aug 2026-present) Top 15% </w:t>
-      </w:r>
-      <w:proofErr w:type="spellStart"/>
-      <w:r>
-        <w:t>tryhackme</w:t>
-      </w:r>
-      <w:proofErr w:type="spellEnd"/>
-      <w:r>
-        <w:t xml:space="preserve"> user with a hacker level rank </w:t>
+        <w:t xml:space="preserve">Tryhackme </w:t>
+      </w:r>
+      <w:r>
+        <w:t xml:space="preserve">(Aug 2026-present) Top 15% tryhackme user with a hacker level rank </w:t>
       </w:r>
       <w:r>
         <w:t>https://tryhackme.com/p/jadd7748</w:t>
@@ -267,23 +239,7 @@
           <w:b/>
           <w:bCs/>
         </w:rPr>
-        <w:t xml:space="preserve">Al </w:t>
-      </w:r>
-      <w:proofErr w:type="spellStart"/>
-      <w:r>
-        <w:rPr>
-          <w:b/>
-          <w:bCs/>
-        </w:rPr>
-        <w:t>Mawared</w:t>
-      </w:r>
-      <w:proofErr w:type="spellEnd"/>
-      <w:r>
-        <w:rPr>
-          <w:b/>
-          <w:bCs/>
-        </w:rPr>
-        <w:t xml:space="preserve"> </w:t>
+        <w:t xml:space="preserve">Al Mawared </w:t>
       </w:r>
       <w:r>
         <w:t>(Jun 2021 – Aug 2022)</w:t>
@@ -296,7 +252,7 @@
           <w:ilvl w:val="0"/>
           <w:numId w:val="1"/>
         </w:numPr>
-        <w:spacing w:after="0" w:line="240" w:lineRule="auto"/>
+        <w:spacing w:after="0"/>
         <w:contextualSpacing w:val="0"/>
       </w:pPr>
       <w:r>
@@ -310,19 +266,11 @@
           <w:ilvl w:val="0"/>
           <w:numId w:val="1"/>
         </w:numPr>
-        <w:spacing w:after="32" w:line="240" w:lineRule="auto"/>
+        <w:spacing w:after="32"/>
         <w:contextualSpacing w:val="0"/>
       </w:pPr>
       <w:r>
-        <w:t xml:space="preserve">Purchasing Department: Managed maintenance and utilities </w:t>
-      </w:r>
-      <w:proofErr w:type="gramStart"/>
-      <w:r>
-        <w:t>purchases</w:t>
-      </w:r>
-      <w:proofErr w:type="gramEnd"/>
-      <w:r>
-        <w:t xml:space="preserve"> within budget (Jun – Jul 2021)</w:t>
+        <w:t>Purchasing Department: Managed maintenance and utilities purchases within budget (Jun – Jul 2021)</w:t>
       </w:r>
     </w:p>
     <w:p>
@@ -344,7 +292,7 @@
           <w:ilvl w:val="0"/>
           <w:numId w:val="1"/>
         </w:numPr>
-        <w:spacing w:after="48" w:line="240" w:lineRule="auto"/>
+        <w:spacing w:after="48"/>
         <w:contextualSpacing w:val="0"/>
       </w:pPr>
       <w:r>
@@ -368,10 +316,7 @@
         <w:t xml:space="preserve">Technical: </w:t>
       </w:r>
       <w:r>
-        <w:t xml:space="preserve">Odoo, </w:t>
-      </w:r>
-      <w:r>
-        <w:t>Python, Java, C++, HTML, CSS, JavaScript, Django, Flutter, Android (Java), Node.js, Express, PostgreSQL, Spring Boot, Docker, Git, Postman, REST APIs, Excel, Word, PowerPoint</w:t>
+        <w:t>Odoo, Python, Java, C++, HTML, CSS, JavaScript, Django, Flutter, Android (Java), Node.js, Express, PostgreSQL, Spring Boot, Docker, Git, Postman, REST APIs, Excel, Word, PowerPoint</w:t>
       </w:r>
     </w:p>
     <w:p>
@@ -496,7 +441,7 @@
     </w:rPrDefault>
     <w:pPrDefault>
       <w:pPr>
-        <w:spacing w:after="64" w:line="240" w:lineRule="auto"/>
+        <w:spacing w:after="64"/>
       </w:pPr>
     </w:pPrDefault>
   </w:docDefaults>
@@ -1236,7 +1181,7 @@
     <w:qFormat/>
     <w:rsid w:val="00B10342"/>
     <w:pPr>
-      <w:spacing w:after="32" w:line="240" w:lineRule="auto"/>
+      <w:spacing w:after="32"/>
       <w:contextualSpacing/>
     </w:pPr>
     <w:rPr>

</xml_diff>